<commit_message>
Update user manual with Docker containerization guide and complete API endpoints catalog
</commit_message>
<xml_diff>
--- a/user_manual.docx
+++ b/user_manual.docx
@@ -5489,6 +5489,508 @@
         <w:t>Data synchronization is automated. If you edit the values in the Product Master or Supplier Master Excel sheets inside the `backend/data/` folder, the Node.js server detects the file modification, wipes the outdated database collections, and synchronizes the new data within 2 seconds. Simply refresh your browser tab to see the updated figures.</w:t>
       </w:r>
     </w:p>
+    <w:p/>
+    <w:p>
+      <w:pPr>
+        <w:pStyle w:val="Heading1"/>
+      </w:pPr>
+      <w:r>
+        <w:t>7. Docker Containerization &amp; Compose Guide</w:t>
+      </w:r>
+    </w:p>
+    <w:p>
+      <w:r>
+        <w:t>To support standard DevOps delivery and simplify deployment on internal server nodes or cloud hosting platforms, the Tariff Tracker application is fully containerized. By separating the frontend React/Nginx static server from the backend Express.js server, the system achieves maximum isolation, security, and scalability.</w:t>
+      </w:r>
+    </w:p>
+    <w:p>
+      <w:pPr>
+        <w:pStyle w:val="Heading2"/>
+      </w:pPr>
+      <w:r>
+        <w:t>Containerizing the Components</w:t>
+      </w:r>
+    </w:p>
+    <w:p>
+      <w:r>
+        <w:t>Each application tier is accompanied by its own Dockerfile specifying the runtime base, environmental packages, port bindings, and ignition triggers:</w:t>
+      </w:r>
+    </w:p>
+    <w:p>
+      <w:r>
+        <w:rPr>
+          <w:b/>
+        </w:rPr>
+        <w:t>Backend Container (Node.js Environment):</w:t>
+        <w:br/>
+      </w:r>
+      <w:r>
+        <w:t>• Base Image: node:20-alpine (lightweight Alpine Linux Node.js environment).</w:t>
+        <w:br/>
+      </w:r>
+      <w:r>
+        <w:t>• Exposed Port: 5000 (standard backend service endpoint).</w:t>
+        <w:br/>
+      </w:r>
+      <w:r>
+        <w:t>• Ignore Rules (.dockerignore): Excludes node_modules, local .env files, git directories, and logs to maintain a clean build cache and security.</w:t>
+        <w:br/>
+      </w:r>
+      <w:r>
+        <w:t>• Startup: Installs only production dependencies (npm ci --omit=dev) and executes node server.js.</w:t>
+      </w:r>
+    </w:p>
+    <w:p>
+      <w:r>
+        <w:rPr>
+          <w:b/>
+        </w:rPr>
+        <w:t>Frontend Container (Multi-Stage Nginx Build):</w:t>
+        <w:br/>
+      </w:r>
+      <w:r>
+        <w:t>• Stage 1 (Build): Uses node:20-alpine to install all developer dependencies (npm ci) and compile static React + Vite web assets (npm run build).</w:t>
+        <w:br/>
+      </w:r>
+      <w:r>
+        <w:t>• Stage 2 (Production): Copies the compiled dist/ output directory to the default serving root directory (/usr/share/nginx/html) of a fresh nginx:stable-alpine image.</w:t>
+        <w:br/>
+      </w:r>
+      <w:r>
+        <w:t>• Exposed Port: 80 (standard HTTP port served by Nginx).</w:t>
+        <w:br/>
+      </w:r>
+      <w:r>
+        <w:t>• Startup: Boots the Nginx daemon in the foreground (nginx -g 'daemon off;').</w:t>
+      </w:r>
+    </w:p>
+    <w:p>
+      <w:pPr>
+        <w:pStyle w:val="Heading2"/>
+      </w:pPr>
+      <w:r>
+        <w:t>Orchestration with Docker Compose</w:t>
+      </w:r>
+    </w:p>
+    <w:p>
+      <w:r>
+        <w:t>A root docker-compose.yml file coordinates local and network deployments, binding port 5000 for the backend and routing port 5173 on the host to port 80 inside Nginx. This makes the application fully available at the familiar dev address http://localhost:5173/ with zero config adjustments.</w:t>
+      </w:r>
+    </w:p>
+    <w:p>
+      <w:r>
+        <w:rPr>
+          <w:b/>
+        </w:rPr>
+        <w:t>Docker CLI Control Commands:</w:t>
+        <w:br/>
+      </w:r>
+      <w:r>
+        <w:t>• Start Multi-Container App (Detached Mode): docker compose up --build -d</w:t>
+        <w:br/>
+      </w:r>
+      <w:r>
+        <w:t>• Check Active Containers Status: docker ps</w:t>
+        <w:br/>
+      </w:r>
+      <w:r>
+        <w:t>• Tear Down and Remove Containers: docker compose down</w:t>
+        <w:br/>
+      </w:r>
+      <w:r>
+        <w:t>• View Container Execution Logs: docker compose logs -f</w:t>
+      </w:r>
+    </w:p>
+    <w:p/>
+    <w:p>
+      <w:pPr>
+        <w:pStyle w:val="Heading1"/>
+      </w:pPr>
+      <w:r>
+        <w:t>8. Complete API Reference Catalog</w:t>
+      </w:r>
+    </w:p>
+    <w:p>
+      <w:r>
+        <w:t>The Tariff Tracker backend exposes 16 REST endpoints that handle database reads, mathematical analysis operations, and external API requests. The catalog below documents every active API route in the application.</w:t>
+      </w:r>
+    </w:p>
+    <w:p>
+      <w:pPr>
+        <w:pStyle w:val="Heading2"/>
+      </w:pPr>
+      <w:r>
+        <w:t>Group 1: Core Database Metadata Routes</w:t>
+      </w:r>
+    </w:p>
+    <w:p>
+      <w:r>
+        <w:rPr>
+          <w:b/>
+        </w:rPr>
+        <w:t>1. Health Check</w:t>
+        <w:br/>
+      </w:r>
+      <w:r>
+        <w:t>• Method &amp; Route: GET /api/health</w:t>
+        <w:br/>
+      </w:r>
+      <w:r>
+        <w:t>• Purpose: Verifies backend is awake and connected to MongoDB.</w:t>
+        <w:br/>
+      </w:r>
+      <w:r>
+        <w:t>• Response Payload: { "status": "success", "message": "API is healthy and MongoDB is connected" }</w:t>
+      </w:r>
+    </w:p>
+    <w:p>
+      <w:r>
+        <w:rPr>
+          <w:b/>
+        </w:rPr>
+        <w:t>2. Retrieve Product Master</w:t>
+        <w:br/>
+      </w:r>
+      <w:r>
+        <w:t>• Method &amp; Route: GET /api/products</w:t>
+        <w:br/>
+      </w:r>
+      <w:r>
+        <w:t>• Purpose: Fetches the array of all products stored in the MongoDB Atlas database.</w:t>
+        <w:br/>
+      </w:r>
+      <w:r>
+        <w:t>• Response Payload: { "status": "success", "products": [...] }</w:t>
+      </w:r>
+    </w:p>
+    <w:p>
+      <w:r>
+        <w:rPr>
+          <w:b/>
+        </w:rPr>
+        <w:t>3. Retrieve Supplier Master</w:t>
+        <w:br/>
+      </w:r>
+      <w:r>
+        <w:t>• Method &amp; Route: GET /api/suppliers</w:t>
+        <w:br/>
+      </w:r>
+      <w:r>
+        <w:t>• Purpose: Fetches the array of all supplier records stored in the database.</w:t>
+        <w:br/>
+      </w:r>
+      <w:r>
+        <w:t>• Response Payload: { "status": "success", "suppliers": [...] }</w:t>
+      </w:r>
+    </w:p>
+    <w:p>
+      <w:r>
+        <w:rPr>
+          <w:b/>
+        </w:rPr>
+        <w:t>4. Retrieve Suppliers by Product erpCode</w:t>
+        <w:br/>
+      </w:r>
+      <w:r>
+        <w:t>• Method &amp; Route: GET /api/suppliers/:productErpCode</w:t>
+        <w:br/>
+      </w:r>
+      <w:r>
+        <w:t>• Purpose: Fetches only suppliers associated with a specific ERP part number.</w:t>
+        <w:br/>
+      </w:r>
+      <w:r>
+        <w:t>• Response Payload: { "status": "success", "suppliers": [...] }</w:t>
+      </w:r>
+    </w:p>
+    <w:p>
+      <w:pPr>
+        <w:pStyle w:val="Heading2"/>
+      </w:pPr>
+      <w:r>
+        <w:t>Group 2: Mathematical Calculations &amp; Analytics Routes</w:t>
+      </w:r>
+    </w:p>
+    <w:p>
+      <w:r>
+        <w:rPr>
+          <w:b/>
+        </w:rPr>
+        <w:t>5. Calculate Risk Records</w:t>
+        <w:br/>
+      </w:r>
+      <w:r>
+        <w:t>• Method &amp; Route: POST /api/calculations/risk-records</w:t>
+        <w:br/>
+      </w:r>
+      <w:r>
+        <w:t>• Purpose: Evaluates VED/SDE levels, OTIF score deviations, and 0-100 risk bands across all inventory.</w:t>
+        <w:br/>
+      </w:r>
+      <w:r>
+        <w:t>• Request Body: Weights and threshold configs.</w:t>
+        <w:br/>
+      </w:r>
+      <w:r>
+        <w:t>• Response Payload: { "success": true, "records": [...], "summary": {...} }</w:t>
+      </w:r>
+    </w:p>
+    <w:p>
+      <w:r>
+        <w:rPr>
+          <w:b/>
+        </w:rPr>
+        <w:t>6. Get Detailed Mathematical Risk Derivations</w:t>
+        <w:br/>
+      </w:r>
+      <w:r>
+        <w:t>• Method &amp; Route: POST /api/calculations/risk-details</w:t>
+        <w:br/>
+      </w:r>
+      <w:r>
+        <w:t>• Purpose: Generates step-by-step risk scoring formulas (ROP, daily consumption) and invokes Amazon Bedrock Claude-3 AI assessments.</w:t>
+        <w:br/>
+      </w:r>
+      <w:r>
+        <w:t>• Request Body: { "product": {...}, "localCrit": 0.5, "localTar": {...}, "localCorr": {...}, "config": {...}, "activeModel": "ModelB" }</w:t>
+        <w:br/>
+      </w:r>
+      <w:r>
+        <w:t>• Response Payload: { "success": true, "calcDetails": { "intermediateVars": {...}, "aiAnalysis": "..." } }</w:t>
+      </w:r>
+    </w:p>
+    <w:p>
+      <w:r>
+        <w:rPr>
+          <w:b/>
+        </w:rPr>
+        <w:t>7. Calculate Landed Costs &amp; Supplier Comparisons</w:t>
+        <w:br/>
+      </w:r>
+      <w:r>
+        <w:t>• Method &amp; Route: POST /api/calculations/tariff</w:t>
+        <w:br/>
+      </w:r>
+      <w:r>
+        <w:t>• Purpose: Calculates basic landed costs breakdown and supplier comparisons for the Tariff Impact Calculator.</w:t>
+        <w:br/>
+      </w:r>
+      <w:r>
+        <w:t>• Request Body: { "selectedProduct": {...}, "destinationCountry": "...", "unitFobPrice": 10, "orderQty": 100, "overrides": {...} }</w:t>
+        <w:br/>
+      </w:r>
+      <w:r>
+        <w:t>• Response Payload: { "success": true, "breakdowns": [...], "comparison": {...} }</w:t>
+      </w:r>
+    </w:p>
+    <w:p>
+      <w:r>
+        <w:rPr>
+          <w:b/>
+        </w:rPr>
+        <w:t>8. Run Scenario Overrides &amp; Tariff Sensitivity Analysis</w:t>
+        <w:br/>
+      </w:r>
+      <w:r>
+        <w:t>• Method &amp; Route: POST /api/calculations/scenario</w:t>
+        <w:br/>
+      </w:r>
+      <w:r>
+        <w:t>• Purpose: Simulates potential tariff policy changes and compiles the 10-level sensitivity matrix.</w:t>
+        <w:br/>
+      </w:r>
+      <w:r>
+        <w:t>• Request Body: Same parameters as `/api/calculations/tariff` plus simulated adjustments.</w:t>
+        <w:br/>
+      </w:r>
+      <w:r>
+        <w:t>• Response Payload: { "success": true, "scenarioResults": {...}, "sensitivityMatrix": [...] }</w:t>
+      </w:r>
+    </w:p>
+    <w:p>
+      <w:r>
+        <w:rPr>
+          <w:b/>
+        </w:rPr>
+        <w:t>9. Solve Procurement Optimization (MILP Sourcing Splits)</w:t>
+        <w:br/>
+      </w:r>
+      <w:r>
+        <w:t>• Method &amp; Route: POST /api/calculations/procurement-optimizer</w:t>
+        <w:br/>
+      </w:r>
+      <w:r>
+        <w:t>• Purpose: Solves supplier order splits based on MOQs and risk ratings, compiles cost forecasts, and generates demand sensing charts.</w:t>
+        <w:br/>
+      </w:r>
+      <w:r>
+        <w:t>• Request Body: { "selectedProduct": {...}, "suppliers": [...], "serviceLevelZ": 1.65, "dailyUse": 2.0, "destinationCountry": "India", "dualSourcingEnabled": true, "maxSharePct": 0.8, "totalDemand": 100, "holdingCostRate": 0.15, "riskWeight": 1.0, "criticalityInfo": {...} }</w:t>
+        <w:br/>
+      </w:r>
+      <w:r>
+        <w:t>• Response Payload: { "success": true, "optimizationResults": { "feasible": true, "solution": {...}, "demandSensingData": [...], "strategies": [...], "optimizedSavingsPct": 12.5 } }</w:t>
+      </w:r>
+    </w:p>
+    <w:p>
+      <w:r>
+        <w:rPr>
+          <w:b/>
+        </w:rPr>
+        <w:t>10. Calculate Criticality Metrics (5x5 Matrix)</w:t>
+        <w:br/>
+      </w:r>
+      <w:r>
+        <w:t>• Method &amp; Route: POST /api/calculations/criticality</w:t>
+        <w:br/>
+      </w:r>
+      <w:r>
+        <w:t>• Purpose: Calculates weighted 5x5 criticality grids and stockout risks.</w:t>
+        <w:br/>
+      </w:r>
+      <w:r>
+        <w:t>• Request Body: { "components": [...], "sdeWeights": {...}, "vedWeights": {...}, ... }</w:t>
+        <w:br/>
+      </w:r>
+      <w:r>
+        <w:t>• Response Payload: { "success": true, "criticalityResults": {...} }</w:t>
+      </w:r>
+    </w:p>
+    <w:p>
+      <w:r>
+        <w:rPr>
+          <w:b/>
+        </w:rPr>
+        <w:t>11. Calculate FOB price adjustments</w:t>
+        <w:br/>
+      </w:r>
+      <w:r>
+        <w:t>• Method &amp; Route: POST /api/calculations/fob-calculator</w:t>
+        <w:br/>
+      </w:r>
+      <w:r>
+        <w:t>• Purpose: Multiplies MOQ parameters by unit price factor on the backend for the Tariff Calculator.</w:t>
+        <w:br/>
+      </w:r>
+      <w:r>
+        <w:t>• Request Body: { "supplierPrice": 10, "moqMultiplier": 3 }</w:t>
+        <w:br/>
+      </w:r>
+      <w:r>
+        <w:t>• Response Payload: { "success": true, "calculatedFob": 30 }</w:t>
+      </w:r>
+    </w:p>
+    <w:p>
+      <w:r>
+        <w:rPr>
+          <w:b/>
+        </w:rPr>
+        <w:t>12. Recalculate Override values</w:t>
+        <w:br/>
+      </w:r>
+      <w:r>
+        <w:t>• Method &amp; Route: POST /api/calculations/override-calculator</w:t>
+        <w:br/>
+      </w:r>
+      <w:r>
+        <w:t>• Purpose: Converts custom tariff overrides and updates the baseline calculation fields on the backend.</w:t>
+        <w:br/>
+      </w:r>
+      <w:r>
+        <w:t>• Request Body: { "originalTariffPct": 5, "overrideValue": 25, "isPercentage": true }</w:t>
+        <w:br/>
+      </w:r>
+      <w:r>
+        <w:t>• Response Payload: { "success": true, "newTariffPct": 25 }</w:t>
+      </w:r>
+    </w:p>
+    <w:p>
+      <w:pPr>
+        <w:pStyle w:val="Heading2"/>
+      </w:pPr>
+      <w:r>
+        <w:t>Group 3: Geopolitical News &amp; External API Proxy Routes</w:t>
+      </w:r>
+    </w:p>
+    <w:p>
+      <w:r>
+        <w:rPr>
+          <w:b/>
+        </w:rPr>
+        <w:t>13. Proxy Trade Tariff Headings</w:t>
+        <w:br/>
+      </w:r>
+      <w:r>
+        <w:t>• Method &amp; Route: GET /api/external/trade-tariff/headings/:id</w:t>
+        <w:br/>
+      </w:r>
+      <w:r>
+        <w:t>• Purpose: Redirects queries to HMRC Trade Tariff API for goods headings.</w:t>
+        <w:br/>
+      </w:r>
+      <w:r>
+        <w:t>• Response Payload: Standard UK Trade Tariff JSON.</w:t>
+      </w:r>
+    </w:p>
+    <w:p>
+      <w:r>
+        <w:rPr>
+          <w:b/>
+        </w:rPr>
+        <w:t>14. Proxy Trade Tariff Chapters</w:t>
+        <w:br/>
+      </w:r>
+      <w:r>
+        <w:t>• Method &amp; Route: GET /api/external/trade-tariff/chapters/:id</w:t>
+        <w:br/>
+      </w:r>
+      <w:r>
+        <w:t>• Purpose: Redirects queries to HMRC Trade Tariff API for goods chapters.</w:t>
+        <w:br/>
+      </w:r>
+      <w:r>
+        <w:t>• Response Payload: Standard UK Trade Tariff JSON.</w:t>
+      </w:r>
+    </w:p>
+    <w:p>
+      <w:r>
+        <w:rPr>
+          <w:b/>
+        </w:rPr>
+        <w:t>15. Proxy Live Countries database</w:t>
+        <w:br/>
+      </w:r>
+      <w:r>
+        <w:t>• Method &amp; Route: GET /api/external/countries</w:t>
+        <w:br/>
+      </w:r>
+      <w:r>
+        <w:t>• Purpose: Proxies REST Countries all-list API for flag links, regional codes, and name profiles.</w:t>
+        <w:br/>
+      </w:r>
+      <w:r>
+        <w:t>• Response Payload: REST Countries all JSON array.</w:t>
+      </w:r>
+    </w:p>
+    <w:p>
+      <w:r>
+        <w:rPr>
+          <w:b/>
+        </w:rPr>
+        <w:t>16. Proxy Exchange Rates</w:t>
+        <w:br/>
+      </w:r>
+      <w:r>
+        <w:t>• Method &amp; Route: GET /api/external/exchange-rates/latest/:baseCurrency</w:t>
+        <w:br/>
+      </w:r>
+      <w:r>
+        <w:t>• Purpose: Fetches global exchange rates using your backend EXCHANGE_RATE_API_KEY environment variable.</w:t>
+        <w:br/>
+      </w:r>
+      <w:r>
+        <w:t>• Response Payload: ExchangeRate-API V6 rates dictionary.</w:t>
+      </w:r>
+    </w:p>
     <w:sectPr>
       <w:pgSz w:w="12240" w:h="15840"/>
       <w:pgMar w:top="1440" w:right="1440" w:bottom="1440" w:left="1440" w:header="720" w:footer="720" w:gutter="0"/>

</xml_diff>

<commit_message>
docs: include World Bank and GDELT external APIs in user manual and technical spec
</commit_message>
<xml_diff>
--- a/user_manual.docx
+++ b/user_manual.docx
@@ -5991,6 +5991,52 @@
         <w:t>• Response Payload: ExchangeRate-API V6 rates dictionary.</w:t>
       </w:r>
     </w:p>
+    <w:p/>
+    <w:p>
+      <w:pPr>
+        <w:pStyle w:val="Heading2"/>
+      </w:pPr>
+      <w:r>
+        <w:t>Group 4: Internal Third-Party API Integrations</w:t>
+      </w:r>
+    </w:p>
+    <w:p>
+      <w:r>
+        <w:t>The backend server also executes direct outgoing HTTP queries to the following public external API services to pull real-time data:</w:t>
+      </w:r>
+    </w:p>
+    <w:p>
+      <w:r>
+        <w:rPr>
+          <w:b/>
+        </w:rPr>
+        <w:t>1. World Bank Logistics Performance Index (LPI) API</w:t>
+        <w:br/>
+      </w:r>
+      <w:r>
+        <w:t>• External Endpoint: https://api.worldbank.org/v2/country/{countryCode}/indicator/LP.LPI.OVRL.XQ?format=json</w:t>
+        <w:br/>
+      </w:r>
+      <w:r>
+        <w:t>• Purpose: Retrieves historical logistics capability index ratings by country code.</w:t>
+      </w:r>
+    </w:p>
+    <w:p>
+      <w:r>
+        <w:rPr>
+          <w:b/>
+        </w:rPr>
+        <w:t>2. GDELT Project News Document API</w:t>
+        <w:br/>
+      </w:r>
+      <w:r>
+        <w:t>• External Endpoint: https://api.gdeltproject.org/api/v2/doc/doc?query=(tariff%20OR%20%22trade%20war%22%20OR%20%22shipping%20disruption%22)%20{countryName}&amp;mode=artlist&amp;format=json&amp;maxrecords=5</w:t>
+        <w:br/>
+      </w:r>
+      <w:r>
+        <w:t>• Purpose: Dynamically searches recent global news publications containing geopolitical corridor and trade-barrier headlines matching a supplier's origin country.</w:t>
+      </w:r>
+    </w:p>
     <w:sectPr>
       <w:pgSz w:w="12240" w:h="15840"/>
       <w:pgMar w:top="1440" w:right="1440" w:bottom="1440" w:left="1440" w:header="720" w:footer="720" w:gutter="0"/>

</xml_diff>